<commit_message>
Actualizar documento Word a versión 1.0 con 4 opciones equitativas
- Versión 1.4 → 1.0 en todo el documento
- Reemplazar referencias a 'primera versión' por 'opción 1'
- Actualizar 'opciones adicionales' a 'opciones 2, 3 y 4'
- Tabla de comparación con numeración equitativa (1-4)
- Referencias '04.6' → 'opciones 2, 3 o 4'
- Eliminar lenguaje que favorece Self-Hosted como default
- Decisiones actualizadas sin destino predeterminado

Co-authored-by: Dennis <denniskano@gmail.com>
</commit_message>
<xml_diff>
--- a/docs/Plan-retiro-Temporal-Cloud-insolvencia.docx
+++ b/docs/Plan-retiro-Temporal-Cloud-insolvencia.docx
@@ -46,7 +46,7 @@
           <w:b/>
           <w:bCs/>
         </w:rPr>
-        <w:t xml:space="preserve">BCP / PEVE / Versión 1.4</w:t>
+        <w:t>BCP / PEVE / Versión 1.0</w:t>
       </w:r>
       <w:r>
         <w:br/>
@@ -142,7 +142,7 @@
               <w:pStyle w:val="Compact"/>
             </w:pPr>
             <w:r>
-              <w:t xml:space="preserve">1.4</w:t>
+              <w:t>1.0</w:t>
             </w:r>
           </w:p>
         </w:tc>
@@ -166,7 +166,7 @@
               <w:pStyle w:val="Compact"/>
             </w:pPr>
             <w:r>
-              <w:t xml:space="preserve">Final para aprobación. La fase 0 queda pendiente de ejecución. Destino de la primera versión: Self-Hosted. Tres opciones adicionales en 04.6.</w:t>
+              <w:t>Final para aprobación. La fase 0 queda pendiente de ejecución. Cuatro destinos evaluados de forma equitativa. Paso 0.0 elige uno.</w:t>
             </w:r>
           </w:p>
         </w:tc>
@@ -469,7 +469,7 @@
               <w:pStyle w:val="Compact"/>
             </w:pPr>
             <w:r>
-              <w:t xml:space="preserve">Temporal Self-Hosted en Azure AKS del Banco (primera versión / vigente). Tres opciones adicionales: sección 04.6</w:t>
+              <w:t>Cuatro opciones evaluadas de forma equitativa: Temporal Self-Hosted, Azure Durable Functions, Dapr Workflows, y Restate. Paso 0.0 elige uno.</w:t>
             </w:r>
           </w:p>
         </w:tc>
@@ -576,7 +576,7 @@
         <w:pStyle w:val="BodyText"/>
       </w:pPr>
       <w:r>
-        <w:t xml:space="preserve">Temporal Cloud es operado por Temporal Technologies Inc. El servidor Temporal, con licencia MIT, puede instalarse y operarse en la infraestructura del Banco. En la primera versión del plan la orquestación se mantiene en el mismo motor. Si el paso 0.0 elige una opción de la sección 04.6, el motor cambia y hay reescritura. Los historiales y el estado de negocio quedan bajo control del BCP en todos los destinos.</w:t>
+        <w:t>Temporal Cloud es operado por Temporal Technologies Inc. El servidor Temporal, con licencia MIT, puede instalarse y operarse en la infraestructura del Banco. En la opción 1 del plan la orquestación se mantiene en el mismo motor. Si el paso 0.0 elige una opción de la opciones 2, 3 o 4, el motor cambia y hay reescritura. Los historiales y el estado de negocio quedan bajo control del BCP en todos los destinos.</w:t>
       </w:r>
     </w:p>
     <w:p>
@@ -645,7 +645,7 @@
         <w:t xml:space="preserve"> </w:t>
       </w:r>
       <w:r>
-        <w:t xml:space="preserve">La primera versión del plan migra hacia Temporal Self-Hosted en Azure AKS. Las tres opciones adicionales de la sección 04.6 (Durable Functions, Dapr Workflows y Restate) se documentan para decisión; no se adoptan en la activación sin aprobación formal. Donde el resto del documento dice Self-Hosted como destino de la migración, léase el destino aprobado (Self-Hosted salvo acta del paso 0.0). La conexión dual, los namespaces Temporal y el Anexo B aplican solo si el destino es Self-Hosted.</w:t>
+        <w:t>La opción 1 del plan migra hacia Temporal Self-Hosted en Azure AKS. Las tres opciones 2, 3 y 4 de la opciones 2, 3 o 4 (Durable Functions, Dapr Workflows y Restate) se documentan para decisión; no se adoptan en la activación sin aprobación formal. Donde el resto del documento dice Self-Hosted como destino de la migración, léase el destino aprobado (Self-Hosted salvo acta del paso 0.0). La conexión dual, los namespaces Temporal y el Anexo B aplican solo si el destino es Self-Hosted.</w:t>
       </w:r>
     </w:p>
     <w:p>
@@ -846,7 +846,7 @@
         <w:t xml:space="preserve"> </w:t>
       </w:r>
       <w:r>
-        <w:t xml:space="preserve">aplicaciones de empresas distintas a BCP; cambios funcionales que no sean necesarios para el retiro; la adopción de un destino de la sección 04.6 sin aprobación formal; la ejecución detallada de los cambios de cada aplicación, que se documenta en sus procedimientos de despliegue aplicando la receta de PEVE.</w:t>
+        <w:t>aplicaciones de empresas distintas a BCP; cambios funcionales que no sean necesarios para el retiro; la adopción de un destino de la opciones 2, 3 o 4 sin aprobación formal; la ejecución detallada de los cambios de cada aplicación, que se documenta en sus procedimientos de despliegue aplicando la receta de PEVE.</w:t>
       </w:r>
     </w:p>
     <w:bookmarkStart w:id="11" w:name="inventario"/>
@@ -1477,7 +1477,7 @@
         <w:t xml:space="preserve"> </w:t>
       </w:r>
       <w:r>
-        <w:t xml:space="preserve">Si el destino es Self-Hosted: código de aplicación en minúsculas seguido del ambiente, por ejemplo apoq-dev, apoq-cert y apoq-prod. Si el destino es 04.6 no hay namespaces Temporal; el inventario registra task hubs, aplicaciones Dapr o deployments Restate equivalentes.</w:t>
+        <w:t>Si el destino es Self-Hosted: código de aplicación en minúsculas seguido del ambiente, por ejemplo apoq-dev, apoq-cert y apoq-prod. Si el destino es opciones 2, 3 o 4 no hay namespaces Temporal; el inventario registra task hubs, aplicaciones Dapr o deployments Restate equivalentes.</w:t>
       </w:r>
     </w:p>
     <w:p>
@@ -1531,7 +1531,7 @@
         <w:t xml:space="preserve"> </w:t>
       </w:r>
       <w:r>
-        <w:t xml:space="preserve">Definir el marco técnico, operativo, contractual, de continuidad y de seguridad para retirar Temporal Cloud del BCP y migrar los casos de uso al destino vigente (Temporal Self-Hosted en Azure AKS), o a un destino de la sección 04.6 si la instancia lo aprueba, sin comprometer la continuidad de las aplicaciones productivas ni la trazabilidad de los workflows.</w:t>
+        <w:t>Definir el marco técnico, operativo, contractual, de continuidad y de seguridad para retirar Temporal Cloud del BCP y migrar los casos de uso al destino elegido por el paso 0.0 (Temporal Self-Hosted en Azure AKS), o a un destino de la opciones 2, 3 o 4 si la instancia lo aprueba, sin comprometer la continuidad de las aplicaciones productivas ni la trazabilidad de los workflows.</w:t>
       </w:r>
     </w:p>
     <w:p>
@@ -1931,7 +1931,7 @@
         </w:numPr>
       </w:pPr>
       <w:r>
-        <w:t xml:space="preserve">Si el destino es una opción de la sección 04.6: no hay reutilización del SDK Temporal. La fase 0 incluye reescritura y no hay conexión dual. El supuesto de “mismo motor” no aplica.</w:t>
+        <w:t>Si el destino es una opción de la opciones 2, 3 o 4: no hay reutilización del SDK Temporal. La fase 0 incluye reescritura y no hay conexión dual. El supuesto de “mismo motor” no aplica.</w:t>
       </w:r>
     </w:p>
     <w:p>
@@ -2035,7 +2035,7 @@
         <w:pStyle w:val="FirstParagraph"/>
       </w:pPr>
       <w:r>
-        <w:t xml:space="preserve">El destino aprobado es Temporal Self-Hosted en Azure AKS, operado por el Banco. PEVE opera el control plane. Las aplicaciones siguen operando sus workers. No se adoptará otra plataforma en el momento de la activación, salvo acta previa del paso 0.0 sobre una opción de la sección 04.6.</w:t>
+        <w:t>El destino aprobado es Temporal Self-Hosted en Azure AKS, operado por el Banco. PEVE opera el control plane. Las aplicaciones siguen operando sus workers. No se adoptará otra plataforma en el momento de la activación, salvo acta previa del paso 0.0 sobre una opción de la opciones 2, 3 o 4.</w:t>
       </w:r>
     </w:p>
     <w:p>
@@ -3173,7 +3173,7 @@
         <w:pStyle w:val="Heading3"/>
       </w:pPr>
       <w:r>
-        <w:t xml:space="preserve">04.6 Opciones adicionales de destino</w:t>
+        <w:t>opciones 2, 3 o 4 Opciones 2, 3 y 4 de destino</w:t>
       </w:r>
     </w:p>
     <w:p>
@@ -3181,7 +3181,7 @@
         <w:pStyle w:val="FirstParagraph"/>
       </w:pPr>
       <w:r>
-        <w:t xml:space="preserve">La primera versión del plan tiene un solo destino: Temporal Self-Hosted en Azure AKS. Conserva el motor, los SDK y la receta de conexión dual. El Banco opera el control plane y</w:t>
+        <w:t>La opción 1 del plan tiene un solo destino: Temporal Self-Hosted en Azure AKS. Conserva el motor, los SDK y la receta de conexión dual. El Banco opera el control plane y</w:t>
       </w:r>
       <w:r>
         <w:t xml:space="preserve"> </w:t>
@@ -3205,7 +3205,7 @@
         <w:pStyle w:val="BodyText"/>
       </w:pPr>
       <w:r>
-        <w:t xml:space="preserve">A esa primera versión se agregan</w:t>
+        <w:t>A esa opción 1 se agregan</w:t>
       </w:r>
       <w:r>
         <w:t xml:space="preserve"> </w:t>
@@ -3215,7 +3215,7 @@
           <w:b/>
           <w:bCs/>
         </w:rPr>
-        <w:t xml:space="preserve">tres opciones adicionales</w:t>
+        <w:t>tres opciones 2, 3 y 4</w:t>
       </w:r>
       <w:r>
         <w:t xml:space="preserve">, todas de la misma categoría que Temporal (ejecución durable en código). Ninguna es un cambio de endpoint: exigen reescritura de workflows y no admiten conexión dual con Temporal Cloud.</w:t>
@@ -3302,7 +3302,7 @@
               <w:pStyle w:val="Compact"/>
             </w:pPr>
             <w:r>
-              <w:t xml:space="preserve">Temporal Self-Hosted (primera versión)</w:t>
+              <w:t>Temporal Self-Hosted (opción 1)</w:t>
             </w:r>
           </w:p>
         </w:tc>
@@ -4780,40 +4780,40 @@
               <w:pStyle w:val="Compact"/>
             </w:pPr>
             <w:r>
-              <w:t xml:space="preserve">Temporal Self-Hosted (1.ª versión)</w:t>
-            </w:r>
-          </w:p>
-        </w:tc>
-        <w:tc>
-          <w:tcPr/>
-          <w:p>
-            <w:pPr>
-              <w:pStyle w:val="Compact"/>
-            </w:pPr>
-            <w:r>
-              <w:t xml:space="preserve">Adic. 1 Durable Functions</w:t>
-            </w:r>
-          </w:p>
-        </w:tc>
-        <w:tc>
-          <w:tcPr/>
-          <w:p>
-            <w:pPr>
-              <w:pStyle w:val="Compact"/>
-            </w:pPr>
-            <w:r>
-              <w:t xml:space="preserve">Adic. 2 Dapr Workflows</w:t>
-            </w:r>
-          </w:p>
-        </w:tc>
-        <w:tc>
-          <w:tcPr/>
-          <w:p>
-            <w:pPr>
-              <w:pStyle w:val="Compact"/>
-            </w:pPr>
-            <w:r>
-              <w:t xml:space="preserve">Adic. 3 Restate</w:t>
+              <w:t>Opción 1: Self-Hosted</w:t>
+            </w:r>
+          </w:p>
+        </w:tc>
+        <w:tc>
+          <w:tcPr/>
+          <w:p>
+            <w:pPr>
+              <w:pStyle w:val="Compact"/>
+            </w:pPr>
+            <w:r>
+              <w:t>Opción 2: Durable Functions</w:t>
+            </w:r>
+          </w:p>
+        </w:tc>
+        <w:tc>
+          <w:tcPr/>
+          <w:p>
+            <w:pPr>
+              <w:pStyle w:val="Compact"/>
+            </w:pPr>
+            <w:r>
+              <w:t>Opción 3: Dapr Workflows</w:t>
+            </w:r>
+          </w:p>
+        </w:tc>
+        <w:tc>
+          <w:tcPr/>
+          <w:p>
+            <w:pPr>
+              <w:pStyle w:val="Compact"/>
+            </w:pPr>
+            <w:r>
+              <w:t>Opción 4: Restate</w:t>
             </w:r>
           </w:p>
         </w:tc>
@@ -5339,7 +5339,7 @@
               <w:pStyle w:val="Compact"/>
             </w:pPr>
             <w:r>
-              <w:t xml:space="preserve">Mantener Self-Hosted (primera versión)</w:t>
+              <w:t>Mantener Self-Hosted (opción 1)</w:t>
             </w:r>
           </w:p>
         </w:tc>
@@ -5363,7 +5363,7 @@
               <w:pStyle w:val="Compact"/>
             </w:pPr>
             <w:r>
-              <w:t xml:space="preserve">Elegir Durable Functions</w:t>
+              <w:t>Elegir Durable Functions (opción 2)</w:t>
             </w:r>
           </w:p>
         </w:tc>
@@ -5387,7 +5387,7 @@
               <w:pStyle w:val="Compact"/>
             </w:pPr>
             <w:r>
-              <w:t xml:space="preserve">Elegir Dapr Workflows</w:t>
+              <w:t>Elegir Dapr Workflows (opción 3)</w:t>
             </w:r>
           </w:p>
         </w:tc>
@@ -5411,7 +5411,7 @@
               <w:pStyle w:val="Compact"/>
             </w:pPr>
             <w:r>
-              <w:t xml:space="preserve">Elegir Restate</w:t>
+              <w:t>Elegir Restate (opción 4)</w:t>
             </w:r>
           </w:p>
         </w:tc>
@@ -5959,7 +5959,7 @@
               <w:pStyle w:val="Compact"/>
             </w:pPr>
             <w:r>
-              <w:t xml:space="preserve">Vigilancia formal. Piloto en un caso no crítico (conexión dual si Self-Hosted; flujo reescrito si 04.6). Acelerar la plataforma destino</w:t>
+              <w:t>Vigilancia formal. Piloto en un caso no crítico (conexión dual si Self-Hosted; flujo reescrito si opciones 2, 3 o 4). Acelerar la plataforma destino</w:t>
             </w:r>
           </w:p>
         </w:tc>
@@ -6767,7 +6767,7 @@
         <w:pStyle w:val="FirstParagraph"/>
       </w:pPr>
       <w:r>
-        <w:t xml:space="preserve">PEVE define la receta. Cada aplicación la ejecuta. Temporal no ofrece migración automatizada de Cloud hacia ningún destino: si el destino es Self-Hosted se actualiza la conexión; si es 04.6 se reescribe el proceso y se corta el tráfico nuevo.</w:t>
+        <w:t>PEVE define la receta. Cada aplicación la ejecuta. Temporal no ofrece migración automatizada de Cloud hacia ningún destino: si el destino es Self-Hosted se actualiza la conexión; si es opciones 2, 3 o 4 se reescribe el proceso y se corta el tráfico nuevo.</w:t>
       </w:r>
     </w:p>
     <w:p>
@@ -6884,7 +6884,7 @@
               <w:pStyle w:val="Compact"/>
             </w:pPr>
             <w:r>
-              <w:t xml:space="preserve">Confirmación del destino (Self-Hosted vigente, o 04.6 si hay acta). Arquitectura, capacidad, receta, inventario, exportación de historiales a almacenamiento del Banco, conexión dual si el destino es Temporal, observabilidad y pruebas iniciales</w:t>
+              <w:t>Confirmación del destino (Self-Hosted vigente, o opciones 2, 3 o 4 si hay acta). Arquitectura, capacidad, receta, inventario, exportación de historiales a almacenamiento del Banco, conexión dual si el destino es Temporal, observabilidad y pruebas iniciales</w:t>
             </w:r>
           </w:p>
         </w:tc>
@@ -8780,7 +8780,7 @@
               <w:pStyle w:val="Compact"/>
             </w:pPr>
             <w:r>
-              <w:t xml:space="preserve">Un caso no crítico en el destino: conexión dual si Self-Hosted, o flujo reescrito si 04.6; conclusión o reapertura; schedules; observabilidad</w:t>
+              <w:t>Un caso no crítico en el destino: conexión dual si Self-Hosted, o flujo reescrito si opciones 2, 3 o 4; conclusión o reapertura; schedules; observabilidad</w:t>
             </w:r>
           </w:p>
         </w:tc>
@@ -9072,7 +9072,7 @@
         <w:pStyle w:val="FirstParagraph"/>
       </w:pPr>
       <w:r>
-        <w:t xml:space="preserve">El riesgo residual se mantiene mientras la preparación preventiva no esté completa (plataforma destino, receta, exportación de historiales, matriz de workflows) o la información operativa no se encuentre actualizada. En Self-Hosted eso incluye clúster y conexión dual. En 04.6 incluye reescritura validada en certificación y ausencia de ejecución simultánea con Cloud. Completar la fase 0 permite ejecutar el retiro ante un cese del proveedor. El resultado financiero del proveedor, por sí solo, no reduce ese residual. El residual de Self-Hosted es operar sin soporte de Temporal Technologies Inc. El residual de Durable Functions o Dapr es lock-in Azure y madurez del modelo Durable Task. El residual de Restate Cloud es la continuidad de un proveedor más joven; el de Restate Self-Managed sin Enterprise es el mismo que el OSS de Temporal.</w:t>
+        <w:t>El riesgo residual se mantiene mientras la preparación preventiva no esté completa (plataforma destino, receta, exportación de historiales, matriz de workflows) o la información operativa no se encuentre actualizada. En Self-Hosted eso incluye clúster y conexión dual. En opciones 2, 3 o 4 incluye reescritura validada en certificación y ausencia de ejecución simultánea con Cloud. Completar la fase 0 permite ejecutar el retiro ante un cese del proveedor. El resultado financiero del proveedor, por sí solo, no reduce ese residual. El residual de Self-Hosted es operar sin soporte de Temporal Technologies Inc. El residual de Durable Functions o Dapr es lock-in Azure y madurez del modelo Durable Task. El residual de Restate Cloud es la continuidad de un proveedor más joven; el de Restate Self-Managed sin Enterprise es el mismo que el OSS de Temporal.</w:t>
       </w:r>
     </w:p>
     <w:p>
@@ -9600,7 +9600,7 @@
               <w:pStyle w:val="Compact"/>
             </w:pPr>
             <w:r>
-              <w:t xml:space="preserve">Acta de destino: Self-Hosted (primera versión) o una opción de la sección 04.6. Sin acta, rige Self-Hosted</w:t>
+              <w:t>Acta de destino: Self-Hosted (opción 1) o una opción de la opciones 2, 3 o 4. Sin acta, rige Self-Hosted</w:t>
             </w:r>
           </w:p>
         </w:tc>
@@ -9702,7 +9702,7 @@
           <w:b/>
           <w:bCs/>
         </w:rPr>
-        <w:t xml:space="preserve">04.6</w:t>
+        <w:t>opciones 2, 3 o 4</w:t>
       </w:r>
       <w:r>
         <w:t xml:space="preserve">, se omiten 0.3 a 0.5 (namespaces y conexión dual) y rigen 0.2b a 0.5b, más 0.6 a 0.10.</w:t>
@@ -10502,7 +10502,7 @@
         <w:pStyle w:val="BodyText"/>
       </w:pPr>
       <w:r>
-        <w:t xml:space="preserve">Al completar el paso 0.10, la plataforma objetivo queda lista para recibir las aplicaciones. La migración productiva sigue reservada a la activación descrita en la sección 06. Un destino 04.6 alarga la fase 0: la reescritura de APOQ y NREM no cabe en el calendario de un solo cambio de endpoint.</w:t>
+        <w:t>Al completar el paso 0.10, la plataforma objetivo queda lista para recibir las aplicaciones. La migración productiva sigue reservada a la activación descrita en la sección 06. Un destino opciones 2, 3 o 4 alarga la fase 0: la reescritura de APOQ y NREM no cabe en el calendario de un solo cambio de endpoint.</w:t>
       </w:r>
     </w:p>
     <w:p>
@@ -10603,7 +10603,7 @@
               <w:pStyle w:val="Compact"/>
             </w:pPr>
             <w:r>
-              <w:t xml:space="preserve">Servidor Temporal de código abierto operado por el Banco en Azure AKS. Destino vigente. Sin soporte de Temporal Technologies Inc.</w:t>
+              <w:t>Servidor Temporal de código abierto operado por el Banco en Azure AKS. Destino elegido por el paso 0.0. Sin soporte de Temporal Technologies Inc.</w:t>
             </w:r>
           </w:p>
         </w:tc>
@@ -10627,7 +10627,7 @@
               <w:pStyle w:val="Compact"/>
             </w:pPr>
             <w:r>
-              <w:t xml:space="preserve">Opción adicional 1. Orquestación Azure (Durable Task Scheduler o Durable Task SDK). Soporte Microsoft</w:t>
+              <w:t>Opción 2. Orquestación Azure (Durable Task Scheduler o Durable Task SDK). Soporte Microsoft</w:t>
             </w:r>
           </w:p>
         </w:tc>
@@ -10651,7 +10651,7 @@
               <w:pStyle w:val="Compact"/>
             </w:pPr>
             <w:r>
-              <w:t xml:space="preserve">Opción adicional 2. Ejecución durable en código sobre sidecars en AKS. Soporte Microsoft / extensión Dapr</w:t>
+              <w:t>Opción 3. Ejecución durable en código sobre sidecars en AKS. Soporte Microsoft / extensión Dapr</w:t>
             </w:r>
           </w:p>
         </w:tc>
@@ -10675,7 +10675,7 @@
               <w:pStyle w:val="Compact"/>
             </w:pPr>
             <w:r>
-              <w:t xml:space="preserve">Opción adicional 3. Motor de ejecución durable en código. Restate Cloud Enterprise o Self-Managed en AKS</w:t>
+              <w:t>Opción 4. Motor de ejecución durable en código. Restate Cloud Enterprise o Self-Managed en AKS</w:t>
             </w:r>
           </w:p>
         </w:tc>
@@ -10795,7 +10795,7 @@
               <w:pStyle w:val="Compact"/>
             </w:pPr>
             <w:r>
-              <w:t xml:space="preserve">Solo si el destino es Self-Hosted. Mismo worker o cliente con dos endpoints Temporal. Un solo clúster activo por ejecución. No aplica a 04.6</w:t>
+              <w:t>Solo si el destino es Self-Hosted. Mismo worker o cliente con dos endpoints Temporal. Un solo clúster activo por ejecución. No aplica a opciones 2, 3 o 4</w:t>
             </w:r>
           </w:p>
         </w:tc>
@@ -12479,7 +12479,7 @@
         <w:pStyle w:val="FirstParagraph"/>
       </w:pPr>
       <w:r>
-        <w:t xml:space="preserve">Objetivo de la fase 0: el Banco puede recibir APOQ y NREM sin depender de Temporal Technologies Inc. en el momento de la activación. La topología de Self-Hosted es la de la sección 04. Si el paso 0.0 elige 04.6, rige B.4 y no B.1–B.2.</w:t>
+        <w:t>Objetivo de la fase 0: el Banco puede recibir APOQ y NREM sin depender de Temporal Technologies Inc. en el momento de la activación. La topología de Self-Hosted es la de la sección 04. Si el paso 0.0 elige opciones 2, 3 o 4, rige B.4 y no B.1–B.2.</w:t>
       </w:r>
     </w:p>
     <w:bookmarkStart w:id="75" w:name="b.1-plataforma"/>
@@ -13232,7 +13232,7 @@
         <w:pStyle w:val="Heading3"/>
       </w:pPr>
       <w:r>
-        <w:t xml:space="preserve">B.4 Receta si el destino es 04.6</w:t>
+        <w:t>B.4 Receta si el destino es opciones 2, 3 o 4</w:t>
       </w:r>
     </w:p>
     <w:p>
@@ -15390,7 +15390,7 @@
               <w:pStyle w:val="Compact"/>
             </w:pPr>
             <w:r>
-              <w:t xml:space="preserve">Acta de destino del paso 0.0 (Self-Hosted o una opción 04.6)</w:t>
+              <w:t>Acta de destino del paso 0.0 (Self-Hosted o una opción opciones 2, 3 o 4)</w:t>
             </w:r>
           </w:p>
         </w:tc>
@@ -16087,7 +16087,7 @@
               <w:pStyle w:val="Compact"/>
             </w:pPr>
             <w:r>
-              <w:t xml:space="preserve">Destino confirmado: Self-Hosted, o acta D13 de una opción 04.6</w:t>
+              <w:t>Destino confirmado: Self-Hosted, o acta D13 de una opción opciones 2, 3 o 4</w:t>
             </w:r>
           </w:p>
         </w:tc>
@@ -16343,7 +16343,7 @@
               <w:pStyle w:val="Compact"/>
             </w:pPr>
             <w:r>
-              <w:t xml:space="preserve">Ejercicio técnico no crítico ejecutado (conexión dual si Self-Hosted; flujo reescrito si 04.6)</w:t>
+              <w:t>Ejercicio técnico no crítico ejecutado (conexión dual si Self-Hosted; flujo reescrito si opciones 2, 3 o 4)</w:t>
             </w:r>
           </w:p>
         </w:tc>
@@ -16503,7 +16503,7 @@
               <w:pStyle w:val="Compact"/>
             </w:pPr>
             <w:r>
-              <w:t xml:space="preserve">Arquitectura conformada: sección 04 si Self-Hosted; patrón 04.6 si F14 cambió el destino</w:t>
+              <w:t>Arquitectura conformada: sección 04 si Self-Hosted; patrón opciones 2, 3 o 4 si F14 cambió el destino</w:t>
             </w:r>
           </w:p>
         </w:tc>
@@ -16740,7 +16740,7 @@
               <w:pStyle w:val="Compact"/>
             </w:pPr>
             <w:r>
-              <w:t xml:space="preserve">Runtime, SKU y región del Durable Task Scheduler o versión Dapr + state store, o versión Restate / plan Enterprise (si 04.6)</w:t>
+              <w:t>Runtime, SKU y región del Durable Task Scheduler o versión Dapr + state store, o versión Restate / plan Enterprise (si opciones 2, 3 o 4)</w:t>
             </w:r>
           </w:p>
         </w:tc>
@@ -16797,7 +16797,7 @@
               <w:pStyle w:val="Compact"/>
             </w:pPr>
             <w:r>
-              <w:t xml:space="preserve">Sección 04.6</w:t>
+              <w:t>Sección opciones 2, 3 o 4</w:t>
             </w:r>
           </w:p>
         </w:tc>
@@ -16915,7 +16915,7 @@
               <w:pStyle w:val="Compact"/>
             </w:pPr>
             <w:r>
-              <w:t xml:space="preserve">Destino de la fase 0 (Self-Hosted o 04.6)</w:t>
+              <w:t>Destino de la fase 0 (Self-Hosted o opciones 2, 3 o 4)</w:t>
             </w:r>
           </w:p>
         </w:tc>
@@ -16937,7 +16937,7 @@
               <w:pStyle w:val="Compact"/>
             </w:pPr>
             <w:r>
-              <w:t xml:space="preserve">Sección 04.6 y paso 0.0</w:t>
+              <w:t>Sección opciones 2, 3 o 4 y paso 0.0</w:t>
             </w:r>
           </w:p>
         </w:tc>

</xml_diff>